<commit_message>
fix(resume): remove extra blank line above SUMMARY in all three resumes
Co-Authored-By: Claude Sonnet 4.6 <noreply@anthropic.com>
</commit_message>
<xml_diff>
--- a/Alex_Nettekoven_Resume_Standard_RL.docx
+++ b/Alex_Nettekoven_Resume_Standard_RL.docx
@@ -103,23 +103,6 @@
           <w:sz w:val="16"/>
           <w:szCs w:val="16"/>
           <w:vertAlign w:val="baseline"/>
-        </w:rPr>
-      </w:pPr>
-      <w:r>
-        <w:rPr>
-          <w:rtl w:val="0"/>
-        </w:rPr>
-      </w:r>
-    </w:p>
-    <w:p>
-      <w:pPr>
-        <w:pBdr>
-          <w:bottom w:color="000000" w:space="1" w:sz="6" w:val="single"/>
-        </w:pBdr>
-        <w:rPr>
-          <w:b w:val="1"/>
-          <w:bCs w:val="1"/>
-          <w:smallCaps w:val="1"/>
         </w:rPr>
       </w:pPr>
       <w:r>

</xml_diff>

<commit_message>
fix(resume): match SUMMARY spacer style to other section headers
Co-Authored-By: Claude Sonnet 4.6 <noreply@anthropic.com>
</commit_message>
<xml_diff>
--- a/Alex_Nettekoven_Resume_Standard_RL.docx
+++ b/Alex_Nettekoven_Resume_Standard_RL.docx
@@ -95,14 +95,12 @@
     </w:p>
     <w:p>
       <w:pPr>
-        <w:pageBreakBefore w:val="0"/>
-        <w:rPr>
-          <w:b w:val="0"/>
-          <w:bCs w:val="0"/>
-          <w:smallCaps w:val="0"/>
-          <w:sz w:val="16"/>
-          <w:szCs w:val="16"/>
-          <w:vertAlign w:val="baseline"/>
+        <w:rPr>
+          <w:b w:val="1"/>
+          <w:bCs w:val="1"/>
+          <w:smallCaps w:val="1"/>
+          <w:sz w:val="20"/>
+          <w:szCs w:val="20"/>
         </w:rPr>
       </w:pPr>
       <w:r>

</xml_diff>

<commit_message>
fix(resume): increase space above SUMMARY by 2pt to fix RWTH Aachen page split
Co-Authored-By: Claude Sonnet 4.6 <noreply@anthropic.com>
</commit_message>
<xml_diff>
--- a/Alex_Nettekoven_Resume_Standard_RL.docx
+++ b/Alex_Nettekoven_Resume_Standard_RL.docx
@@ -99,8 +99,8 @@
           <w:b w:val="1"/>
           <w:bCs w:val="1"/>
           <w:smallCaps w:val="1"/>
-          <w:sz w:val="20"/>
-          <w:szCs w:val="20"/>
+          <w:sz w:val="24"/>
+          <w:szCs w:val="24"/>
         </w:rPr>
       </w:pPr>
       <w:r>

</xml_diff>

<commit_message>
fix(resume): increase SUMMARY spacer by 2 more pts (now 14pt)
Co-Authored-By: Claude Sonnet 4.6 <noreply@anthropic.com>
</commit_message>
<xml_diff>
--- a/Alex_Nettekoven_Resume_Standard_RL.docx
+++ b/Alex_Nettekoven_Resume_Standard_RL.docx
@@ -99,8 +99,8 @@
           <w:b w:val="1"/>
           <w:bCs w:val="1"/>
           <w:smallCaps w:val="1"/>
-          <w:sz w:val="24"/>
-          <w:szCs w:val="24"/>
+          <w:sz w:val="28"/>
+          <w:szCs w:val="28"/>
         </w:rPr>
       </w:pPr>
       <w:r>

</xml_diff>

<commit_message>
fix(resume): increase SUMMARY spacer by 2 more pts (now 16pt)
Co-Authored-By: Claude Sonnet 4.6 <noreply@anthropic.com>
</commit_message>
<xml_diff>
--- a/Alex_Nettekoven_Resume_Standard_RL.docx
+++ b/Alex_Nettekoven_Resume_Standard_RL.docx
@@ -99,8 +99,8 @@
           <w:b w:val="1"/>
           <w:bCs w:val="1"/>
           <w:smallCaps w:val="1"/>
-          <w:sz w:val="28"/>
-          <w:szCs w:val="28"/>
+          <w:sz w:val="32"/>
+          <w:szCs w:val="32"/>
         </w:rPr>
       </w:pPr>
       <w:r>

</xml_diff>

<commit_message>
fix(resume): add missing spacer after ADDITIONAL INFORMATION header
Co-Authored-By: Claude Sonnet 4.6 <noreply@anthropic.com>
</commit_message>
<xml_diff>
--- a/Alex_Nettekoven_Resume_Standard_RL.docx
+++ b/Alex_Nettekoven_Resume_Standard_RL.docx
@@ -2047,6 +2047,19 @@
         </w:rPr>
         <w:t xml:space="preserve">ADDITIONAL INFORMATION</w:t>
       </w:r>
+      <w:r>
+        <w:rPr>
+          <w:rtl w:val="0"/>
+        </w:rPr>
+      </w:r>
+    </w:p>
+    <w:p>
+      <w:pPr>
+        <w:rPr>
+          <w:sz w:val="10"/>
+          <w:szCs w:val="10"/>
+        </w:rPr>
+      </w:pPr>
       <w:r>
         <w:rPr>
           <w:rtl w:val="0"/>

</xml_diff>